<commit_message>
Remove yellow dividers from CV, replace with typography hierarchy
Section headings now use 10pt bold + letter-spacing + generous spacing-before
instead of yellow bottom border lines. Cleaner, more professional hierarchy.

Co-Authored-By: Claude Sonnet 4.6 <noreply@anthropic.com>
</commit_message>
<xml_diff>
--- a/Main Page/etc/Ori_Cohen_CV.docx
+++ b/Main Page/etc/Ori_Cohen_CV.docx
@@ -29,10 +29,7 @@
     </w:p>
     <w:p>
       <w:pPr>
-        <w:pBdr>
-          <w:bottom w:val="single" w:sz="10" w:space="1" w:color="F5C800"/>
-        </w:pBdr>
-        <w:spacing w:after="140"/>
+        <w:spacing w:after="160"/>
       </w:pPr>
     </w:p>
     <w:p>
@@ -121,15 +118,15 @@
     </w:p>
     <w:p>
       <w:pPr>
-        <w:pBdr>
-          <w:bottom w:val="single" w:sz="6" w:space="3" w:color="F5C800"/>
-        </w:pBdr>
-        <w:spacing w:before="220" w:after="100"/>
+        <w:spacing w:before="80" w:after="120"/>
       </w:pPr>
       <w:r>
         <w:rPr>
           <w:b/>
           <w:bCs/>
+          <w:sz w:val="20"/>
+          <w:szCs w:val="20"/>
+          <w:spacing w:val="80"/>
         </w:rPr>
         <w:t>ABOUT</w:t>
       </w:r>
@@ -144,12 +141,6 @@
           <w:szCs w:val="17"/>
         </w:rPr>
         <w:t>Product Designer and Design Team Lead with 5+ years of experience building enterprise products end-to-end.</w:t>
-      </w:r>
-      <w:r>
-        <w:rPr>
-          <w:sz w:val="17"/>
-          <w:szCs w:val="17"/>
-        </w:rPr>
         <w:br/>
       </w:r>
       <w:r>
@@ -166,33 +157,21 @@
           <w:szCs w:val="17"/>
         </w:rPr>
         <w:t>discovery and user research to final delivery - and bring the same level of care to strategy and execution.</w:t>
-      </w:r>
-      <w:r>
-        <w:rPr>
-          <w:sz w:val="17"/>
-          <w:szCs w:val="17"/>
-        </w:rPr>
         <w:br/>
-      </w:r>
-      <w:r>
-        <w:rPr>
-          <w:sz w:val="17"/>
-          <w:szCs w:val="17"/>
-        </w:rPr>
         <w:t>Currently leading a team of designers at Verint, driving mobile UX and new product features.</w:t>
       </w:r>
     </w:p>
     <w:p>
       <w:pPr>
-        <w:pBdr>
-          <w:bottom w:val="single" w:sz="6" w:space="3" w:color="F5C800"/>
-        </w:pBdr>
-        <w:spacing w:before="220" w:after="100"/>
+        <w:spacing w:before="320" w:after="120"/>
       </w:pPr>
       <w:r>
         <w:rPr>
           <w:b/>
           <w:bCs/>
+          <w:sz w:val="20"/>
+          <w:szCs w:val="20"/>
+          <w:spacing w:val="80"/>
         </w:rPr>
         <w:t>EXPERIENCE</w:t>
       </w:r>
@@ -756,15 +735,15 @@
     </w:p>
     <w:p>
       <w:pPr>
-        <w:pBdr>
-          <w:bottom w:val="single" w:sz="6" w:space="3" w:color="F5C800"/>
-        </w:pBdr>
-        <w:spacing w:before="220" w:after="100"/>
+        <w:spacing w:before="320" w:after="120"/>
       </w:pPr>
       <w:r>
         <w:rPr>
           <w:b/>
           <w:bCs/>
+          <w:sz w:val="20"/>
+          <w:szCs w:val="20"/>
+          <w:spacing w:val="80"/>
         </w:rPr>
         <w:t>SKILLS</w:t>
       </w:r>
@@ -916,28 +895,7 @@
                 <w:sz w:val="17"/>
                 <w:szCs w:val="17"/>
               </w:rPr>
-              <w:t>Figma  •  Framer  •  Cursor  •  Illustrator  •  Photoshop  •  After Effects  •  Premiere Pro  •  WordPress  •  Elementor  •  HTML/CSS</w:t>
-            </w:r>
-            <w:r>
-              <w:rPr>
-                <w:sz w:val="17"/>
-                <w:szCs w:val="17"/>
-              </w:rPr>
-              <w:t xml:space="preserve"> </w:t>
-            </w:r>
-            <w:r>
-              <w:rPr>
-                <w:sz w:val="17"/>
-                <w:szCs w:val="17"/>
-              </w:rPr>
-              <w:t>•</w:t>
-            </w:r>
-            <w:r>
-              <w:rPr>
-                <w:sz w:val="17"/>
-                <w:szCs w:val="17"/>
-              </w:rPr>
-              <w:t xml:space="preserve"> Storybook</w:t>
+              <w:t>Figma  •  Framer  •  Cursor  •  Illustrator  •  Photoshop  •  After Effects  •  Premiere Pro  •  WordPress  •  Elementor  •  HTML/CSS • Storybook</w:t>
             </w:r>
           </w:p>
         </w:tc>
@@ -950,15 +908,15 @@
     </w:p>
     <w:p>
       <w:pPr>
-        <w:pBdr>
-          <w:bottom w:val="single" w:sz="6" w:space="3" w:color="F5C800"/>
-        </w:pBdr>
-        <w:spacing w:before="220" w:after="100"/>
+        <w:spacing w:before="320" w:after="120"/>
       </w:pPr>
       <w:r>
         <w:rPr>
           <w:b/>
           <w:bCs/>
+          <w:sz w:val="20"/>
+          <w:szCs w:val="20"/>
+          <w:spacing w:val="80"/>
         </w:rPr>
         <w:t>EDUCATION</w:t>
       </w:r>
@@ -1210,15 +1168,15 @@
     </w:p>
     <w:p>
       <w:pPr>
-        <w:pBdr>
-          <w:bottom w:val="single" w:sz="6" w:space="3" w:color="F5C800"/>
-        </w:pBdr>
-        <w:spacing w:before="220" w:after="100"/>
+        <w:spacing w:before="320" w:after="120"/>
       </w:pPr>
       <w:r>
         <w:rPr>
           <w:b/>
           <w:bCs/>
+          <w:sz w:val="20"/>
+          <w:szCs w:val="20"/>
+          <w:spacing w:val="80"/>
         </w:rPr>
         <w:t>MILITARY SERVICE</w:t>
       </w:r>
@@ -1374,15 +1332,15 @@
     </w:p>
     <w:p>
       <w:pPr>
-        <w:pBdr>
-          <w:bottom w:val="single" w:sz="6" w:space="3" w:color="F5C800"/>
-        </w:pBdr>
-        <w:spacing w:before="220" w:after="100"/>
+        <w:spacing w:before="320" w:after="120"/>
       </w:pPr>
       <w:r>
         <w:rPr>
           <w:b/>
           <w:bCs/>
+          <w:sz w:val="20"/>
+          <w:szCs w:val="20"/>
+          <w:spacing w:val="80"/>
         </w:rPr>
         <w:t>LANGUAGES</w:t>
       </w:r>

</xml_diff>

<commit_message>
CV: restore dividers with brand purple (#A259FF), revert typography
Brought back the horizontal dividers under each section heading
with Verint brand purple instead of yellow. Reverted to original
typography (no sz/spacing changes).

Co-Authored-By: Claude Sonnet 4.6 <noreply@anthropic.com>
</commit_message>
<xml_diff>
--- a/Main Page/etc/Ori_Cohen_CV.docx
+++ b/Main Page/etc/Ori_Cohen_CV.docx
@@ -29,7 +29,10 @@
     </w:p>
     <w:p>
       <w:pPr>
-        <w:spacing w:after="160"/>
+        <w:pBdr>
+          <w:bottom w:val="single" w:sz="10" w:space="1" w:color="A259FF"/>
+        </w:pBdr>
+        <w:spacing w:after="140"/>
       </w:pPr>
     </w:p>
     <w:p>
@@ -118,15 +121,15 @@
     </w:p>
     <w:p>
       <w:pPr>
-        <w:spacing w:before="80" w:after="120"/>
+        <w:pBdr>
+          <w:bottom w:val="single" w:sz="6" w:space="3" w:color="A259FF"/>
+        </w:pBdr>
+        <w:spacing w:before="220" w:after="100"/>
       </w:pPr>
       <w:r>
         <w:rPr>
           <w:b/>
           <w:bCs/>
-          <w:sz w:val="20"/>
-          <w:szCs w:val="20"/>
-          <w:spacing w:val="80"/>
         </w:rPr>
         <w:t>ABOUT</w:t>
       </w:r>
@@ -163,15 +166,15 @@
     </w:p>
     <w:p>
       <w:pPr>
-        <w:spacing w:before="320" w:after="120"/>
+        <w:pBdr>
+          <w:bottom w:val="single" w:sz="6" w:space="3" w:color="A259FF"/>
+        </w:pBdr>
+        <w:spacing w:before="220" w:after="100"/>
       </w:pPr>
       <w:r>
         <w:rPr>
           <w:b/>
           <w:bCs/>
-          <w:sz w:val="20"/>
-          <w:szCs w:val="20"/>
-          <w:spacing w:val="80"/>
         </w:rPr>
         <w:t>EXPERIENCE</w:t>
       </w:r>
@@ -735,15 +738,15 @@
     </w:p>
     <w:p>
       <w:pPr>
-        <w:spacing w:before="320" w:after="120"/>
+        <w:pBdr>
+          <w:bottom w:val="single" w:sz="6" w:space="3" w:color="A259FF"/>
+        </w:pBdr>
+        <w:spacing w:before="220" w:after="100"/>
       </w:pPr>
       <w:r>
         <w:rPr>
           <w:b/>
           <w:bCs/>
-          <w:sz w:val="20"/>
-          <w:szCs w:val="20"/>
-          <w:spacing w:val="80"/>
         </w:rPr>
         <w:t>SKILLS</w:t>
       </w:r>
@@ -908,15 +911,15 @@
     </w:p>
     <w:p>
       <w:pPr>
-        <w:spacing w:before="320" w:after="120"/>
+        <w:pBdr>
+          <w:bottom w:val="single" w:sz="6" w:space="3" w:color="A259FF"/>
+        </w:pBdr>
+        <w:spacing w:before="220" w:after="100"/>
       </w:pPr>
       <w:r>
         <w:rPr>
           <w:b/>
           <w:bCs/>
-          <w:sz w:val="20"/>
-          <w:szCs w:val="20"/>
-          <w:spacing w:val="80"/>
         </w:rPr>
         <w:t>EDUCATION</w:t>
       </w:r>
@@ -1168,15 +1171,15 @@
     </w:p>
     <w:p>
       <w:pPr>
-        <w:spacing w:before="320" w:after="120"/>
+        <w:pBdr>
+          <w:bottom w:val="single" w:sz="6" w:space="3" w:color="A259FF"/>
+        </w:pBdr>
+        <w:spacing w:before="220" w:after="100"/>
       </w:pPr>
       <w:r>
         <w:rPr>
           <w:b/>
           <w:bCs/>
-          <w:sz w:val="20"/>
-          <w:szCs w:val="20"/>
-          <w:spacing w:val="80"/>
         </w:rPr>
         <w:t>MILITARY SERVICE</w:t>
       </w:r>
@@ -1332,15 +1335,15 @@
     </w:p>
     <w:p>
       <w:pPr>
-        <w:spacing w:before="320" w:after="120"/>
+        <w:pBdr>
+          <w:bottom w:val="single" w:sz="6" w:space="3" w:color="A259FF"/>
+        </w:pBdr>
+        <w:spacing w:before="220" w:after="100"/>
       </w:pPr>
       <w:r>
         <w:rPr>
           <w:b/>
           <w:bCs/>
-          <w:sz w:val="20"/>
-          <w:szCs w:val="20"/>
-          <w:spacing w:val="80"/>
         </w:rPr>
         <w:t>LANGUAGES</w:t>
       </w:r>

</xml_diff>

<commit_message>
CV: use text-width underline instead of full-width border
Replaced paragraph bottom borders with character underline (w:u)
in brand purple — line now spans only the heading text width.

Co-Authored-By: Claude Sonnet 4.6 <noreply@anthropic.com>
</commit_message>
<xml_diff>
--- a/Main Page/etc/Ori_Cohen_CV.docx
+++ b/Main Page/etc/Ori_Cohen_CV.docx
@@ -29,9 +29,6 @@
     </w:p>
     <w:p>
       <w:pPr>
-        <w:pBdr>
-          <w:bottom w:val="single" w:sz="10" w:space="1" w:color="A259FF"/>
-        </w:pBdr>
         <w:spacing w:after="140"/>
       </w:pPr>
     </w:p>
@@ -121,15 +118,13 @@
     </w:p>
     <w:p>
       <w:pPr>
-        <w:pBdr>
-          <w:bottom w:val="single" w:sz="6" w:space="3" w:color="A259FF"/>
-        </w:pBdr>
         <w:spacing w:before="220" w:after="100"/>
       </w:pPr>
       <w:r>
         <w:rPr>
           <w:b/>
           <w:bCs/>
+          <w:u w:val="single" w:color="A259FF"/>
         </w:rPr>
         <w:t>ABOUT</w:t>
       </w:r>
@@ -166,15 +161,13 @@
     </w:p>
     <w:p>
       <w:pPr>
-        <w:pBdr>
-          <w:bottom w:val="single" w:sz="6" w:space="3" w:color="A259FF"/>
-        </w:pBdr>
         <w:spacing w:before="220" w:after="100"/>
       </w:pPr>
       <w:r>
         <w:rPr>
           <w:b/>
           <w:bCs/>
+          <w:u w:val="single" w:color="A259FF"/>
         </w:rPr>
         <w:t>EXPERIENCE</w:t>
       </w:r>
@@ -738,15 +731,13 @@
     </w:p>
     <w:p>
       <w:pPr>
-        <w:pBdr>
-          <w:bottom w:val="single" w:sz="6" w:space="3" w:color="A259FF"/>
-        </w:pBdr>
         <w:spacing w:before="220" w:after="100"/>
       </w:pPr>
       <w:r>
         <w:rPr>
           <w:b/>
           <w:bCs/>
+          <w:u w:val="single" w:color="A259FF"/>
         </w:rPr>
         <w:t>SKILLS</w:t>
       </w:r>
@@ -911,15 +902,13 @@
     </w:p>
     <w:p>
       <w:pPr>
-        <w:pBdr>
-          <w:bottom w:val="single" w:sz="6" w:space="3" w:color="A259FF"/>
-        </w:pBdr>
         <w:spacing w:before="220" w:after="100"/>
       </w:pPr>
       <w:r>
         <w:rPr>
           <w:b/>
           <w:bCs/>
+          <w:u w:val="single" w:color="A259FF"/>
         </w:rPr>
         <w:t>EDUCATION</w:t>
       </w:r>
@@ -1171,15 +1160,13 @@
     </w:p>
     <w:p>
       <w:pPr>
-        <w:pBdr>
-          <w:bottom w:val="single" w:sz="6" w:space="3" w:color="A259FF"/>
-        </w:pBdr>
         <w:spacing w:before="220" w:after="100"/>
       </w:pPr>
       <w:r>
         <w:rPr>
           <w:b/>
           <w:bCs/>
+          <w:u w:val="single" w:color="A259FF"/>
         </w:rPr>
         <w:t>MILITARY SERVICE</w:t>
       </w:r>
@@ -1335,15 +1322,13 @@
     </w:p>
     <w:p>
       <w:pPr>
-        <w:pBdr>
-          <w:bottom w:val="single" w:sz="6" w:space="3" w:color="A259FF"/>
-        </w:pBdr>
         <w:spacing w:before="220" w:after="100"/>
       </w:pPr>
       <w:r>
         <w:rPr>
           <w:b/>
           <w:bCs/>
+          <w:u w:val="single" w:color="A259FF"/>
         </w:rPr>
         <w:t>LANGUAGES</w:t>
       </w:r>

</xml_diff>

<commit_message>
CV: add Portfolio link, update LinkedIn text to Press Here
Co-Authored-By: Claude Sonnet 4.6 <noreply@anthropic.com>
</commit_message>
<xml_diff>
--- a/Main Page/etc/Ori_Cohen_CV.docx
+++ b/Main Page/etc/Ori_Cohen_CV.docx
@@ -36,6 +36,35 @@
       <w:pPr>
         <w:spacing w:after="140"/>
       </w:pPr>
+      <w:r>
+        <w:rPr>
+          <w:b/>
+          <w:bCs/>
+          <w:color w:val="666666"/>
+          <w:sz w:val="17"/>
+          <w:szCs w:val="17"/>
+        </w:rPr>
+        <w:t xml:space="preserve">Portfolio: </w:t>
+      </w:r>
+      <w:hyperlink r:id="rId10" w:history="1">
+        <w:r>
+          <w:rPr>
+            <w:rStyle w:val="Hyperlink"/>
+            <w:sz w:val="17"/>
+            <w:szCs w:val="17"/>
+            <w:u w:color="0563C1"/>
+          </w:rPr>
+          <w:t>Press Here</w:t>
+        </w:r>
+      </w:hyperlink>
+      <w:r>
+        <w:rPr>
+          <w:color w:val="CCCCCC"/>
+          <w:sz w:val="17"/>
+          <w:szCs w:val="17"/>
+        </w:rPr>
+        <w:t xml:space="preserve">   |   </w:t>
+      </w:r>
       <w:r>
         <w:rPr>
           <w:b/>
@@ -112,7 +141,7 @@
             <w:szCs w:val="17"/>
             <w:u w:color="0563C1"/>
           </w:rPr>
-          <w:t>ori-cohen-hello</w:t>
+          <w:t>Press Here</w:t>
         </w:r>
       </w:hyperlink>
     </w:p>

</xml_diff>

<commit_message>
CV: compress to 1 page, fix orphaned words with non-breaking spaces
Reduced spacing and margins to fit on single page.
Added non-breaking spaces to keep "and QA" and "animated social content" together.

Co-Authored-By: Claude Sonnet 4.6 <noreply@anthropic.com>
</commit_message>
<xml_diff>
--- a/Main Page/etc/Ori_Cohen_CV.docx
+++ b/Main Page/etc/Ori_Cohen_CV.docx
@@ -4,7 +4,7 @@
   <w:body>
     <w:p>
       <w:pPr>
-        <w:spacing w:after="30"/>
+        <w:spacing w:after="20"/>
       </w:pPr>
       <w:r>
         <w:rPr>
@@ -18,7 +18,7 @@
     </w:p>
     <w:p>
       <w:pPr>
-        <w:spacing w:after="14"/>
+        <w:spacing w:after="4"/>
       </w:pPr>
       <w:r>
         <w:rPr>
@@ -29,20 +29,20 @@
     </w:p>
     <w:p>
       <w:pPr>
-        <w:spacing w:after="140"/>
+        <w:spacing w:after="20"/>
       </w:pPr>
     </w:p>
     <w:p>
       <w:pPr>
-        <w:spacing w:after="140"/>
+        <w:spacing w:after="20"/>
       </w:pPr>
       <w:r>
         <w:rPr>
           <w:b/>
           <w:bCs/>
           <w:color w:val="666666"/>
-          <w:sz w:val="17"/>
-          <w:szCs w:val="17"/>
+          <w:sz w:val="16"/>
+          <w:szCs w:val="16"/>
         </w:rPr>
         <w:t xml:space="preserve">Portfolio: </w:t>
       </w:r>
@@ -50,8 +50,8 @@
         <w:r>
           <w:rPr>
             <w:rStyle w:val="Hyperlink"/>
-            <w:sz w:val="17"/>
-            <w:szCs w:val="17"/>
+            <w:sz w:val="16"/>
+            <w:szCs w:val="16"/>
             <w:u w:color="0563C1"/>
           </w:rPr>
           <w:t>Press Here</w:t>
@@ -60,8 +60,8 @@
       <w:r>
         <w:rPr>
           <w:color w:val="CCCCCC"/>
-          <w:sz w:val="17"/>
-          <w:szCs w:val="17"/>
+          <w:sz w:val="16"/>
+          <w:szCs w:val="16"/>
         </w:rPr>
         <w:t xml:space="preserve">   |   </w:t>
       </w:r>
@@ -70,8 +70,8 @@
           <w:b/>
           <w:bCs/>
           <w:color w:val="666666"/>
-          <w:sz w:val="17"/>
-          <w:szCs w:val="17"/>
+          <w:sz w:val="16"/>
+          <w:szCs w:val="16"/>
         </w:rPr>
         <w:t xml:space="preserve">Tel: </w:t>
       </w:r>
@@ -79,8 +79,8 @@
         <w:r>
           <w:rPr>
             <w:rStyle w:val="Hyperlink"/>
-            <w:sz w:val="17"/>
-            <w:szCs w:val="17"/>
+            <w:sz w:val="16"/>
+            <w:szCs w:val="16"/>
             <w:u w:color="0563C1"/>
           </w:rPr>
           <w:t>054-3383953</w:t>
@@ -89,8 +89,8 @@
       <w:r>
         <w:rPr>
           <w:color w:val="CCCCCC"/>
-          <w:sz w:val="17"/>
-          <w:szCs w:val="17"/>
+          <w:sz w:val="16"/>
+          <w:szCs w:val="16"/>
         </w:rPr>
         <w:t xml:space="preserve">   |   </w:t>
       </w:r>
@@ -99,8 +99,8 @@
           <w:b/>
           <w:bCs/>
           <w:color w:val="666666"/>
-          <w:sz w:val="17"/>
-          <w:szCs w:val="17"/>
+          <w:sz w:val="16"/>
+          <w:szCs w:val="16"/>
         </w:rPr>
         <w:t xml:space="preserve">Mail: </w:t>
       </w:r>
@@ -108,8 +108,8 @@
         <w:r>
           <w:rPr>
             <w:rStyle w:val="Hyperlink"/>
-            <w:sz w:val="17"/>
-            <w:szCs w:val="17"/>
+            <w:sz w:val="16"/>
+            <w:szCs w:val="16"/>
             <w:u w:color="0563C1"/>
           </w:rPr>
           <w:t>oricohenw@gmail.com</w:t>
@@ -118,8 +118,8 @@
       <w:r>
         <w:rPr>
           <w:color w:val="CCCCCC"/>
-          <w:sz w:val="17"/>
-          <w:szCs w:val="17"/>
+          <w:sz w:val="16"/>
+          <w:szCs w:val="16"/>
         </w:rPr>
         <w:t xml:space="preserve">   |   </w:t>
       </w:r>
@@ -128,8 +128,8 @@
           <w:b/>
           <w:bCs/>
           <w:color w:val="666666"/>
-          <w:sz w:val="17"/>
-          <w:szCs w:val="17"/>
+          <w:sz w:val="16"/>
+          <w:szCs w:val="16"/>
         </w:rPr>
         <w:t xml:space="preserve">LinkedIn: </w:t>
       </w:r>
@@ -137,8 +137,8 @@
         <w:r>
           <w:rPr>
             <w:rStyle w:val="Hyperlink"/>
-            <w:sz w:val="17"/>
-            <w:szCs w:val="17"/>
+            <w:sz w:val="16"/>
+            <w:szCs w:val="16"/>
             <w:u w:color="0563C1"/>
           </w:rPr>
           <w:t>Press Here</w:t>
@@ -147,7 +147,7 @@
     </w:p>
     <w:p>
       <w:pPr>
-        <w:spacing w:before="220" w:after="100"/>
+        <w:spacing w:before="100" w:after="40"/>
       </w:pPr>
       <w:r>
         <w:rPr>
@@ -160,28 +160,28 @@
     </w:p>
     <w:p>
       <w:pPr>
-        <w:spacing w:after="140"/>
+        <w:spacing w:after="20"/>
       </w:pPr>
       <w:r>
         <w:rPr>
-          <w:sz w:val="17"/>
-          <w:szCs w:val="17"/>
+          <w:sz w:val="16"/>
+          <w:szCs w:val="16"/>
         </w:rPr>
         <w:t>Product Designer and Design Team Lead with 5+ years of experience building enterprise products end-to-end.</w:t>
         <w:br/>
       </w:r>
       <w:r>
         <w:rPr>
-          <w:sz w:val="17"/>
-          <w:szCs w:val="17"/>
+          <w:sz w:val="16"/>
+          <w:szCs w:val="16"/>
           <w:lang w:val="en-US"/>
         </w:rPr>
         <w:t xml:space="preserve">From </w:t>
       </w:r>
       <w:r>
         <w:rPr>
-          <w:sz w:val="17"/>
-          <w:szCs w:val="17"/>
+          <w:sz w:val="16"/>
+          <w:szCs w:val="16"/>
         </w:rPr>
         <w:t>discovery and user research to final delivery - and bring the same level of care to strategy and execution.</w:t>
         <w:br/>
@@ -190,7 +190,7 @@
     </w:p>
     <w:p>
       <w:pPr>
-        <w:spacing w:before="220" w:after="100"/>
+        <w:spacing w:before="100" w:after="40"/>
       </w:pPr>
       <w:r>
         <w:rPr>
@@ -203,7 +203,7 @@
     </w:p>
     <w:p>
       <w:pPr>
-        <w:spacing w:after="80"/>
+        <w:spacing w:after="20"/>
       </w:pPr>
     </w:p>
     <w:tbl>
@@ -252,7 +252,7 @@
           </w:tcPr>
           <w:p>
             <w:pPr>
-              <w:spacing w:after="14"/>
+              <w:spacing w:after="4"/>
             </w:pPr>
             <w:r>
               <w:rPr>
@@ -294,7 +294,7 @@
           </w:tcPr>
           <w:p>
             <w:pPr>
-              <w:spacing w:after="40"/>
+              <w:spacing w:after="14"/>
             </w:pPr>
             <w:r>
               <w:rPr>
@@ -308,48 +308,48 @@
           </w:p>
           <w:p>
             <w:pPr>
-              <w:spacing w:before="30"/>
-            </w:pPr>
-            <w:r>
-              <w:rPr>
-                <w:sz w:val="17"/>
-                <w:szCs w:val="17"/>
+              <w:spacing w:before="10"/>
+            </w:pPr>
+            <w:r>
+              <w:rPr>
+                <w:sz w:val="16"/>
+                <w:szCs w:val="16"/>
               </w:rPr>
               <w:t>• Leading a team of product designers, providing mentorship, design reviews, and cross-functional alignment with product and dev teams</w:t>
             </w:r>
           </w:p>
           <w:p>
             <w:pPr>
-              <w:spacing w:before="30"/>
-            </w:pPr>
-            <w:r>
-              <w:rPr>
-                <w:sz w:val="17"/>
-                <w:szCs w:val="17"/>
+              <w:spacing w:before="10"/>
+            </w:pPr>
+            <w:r>
+              <w:rPr>
+                <w:sz w:val="16"/>
+                <w:szCs w:val="16"/>
               </w:rPr>
               <w:t>• Owning the mobile UX domain - defining patterns, standards, and end-to-end accessible flows for mobile features</w:t>
             </w:r>
           </w:p>
           <w:p>
             <w:pPr>
-              <w:spacing w:before="30"/>
-            </w:pPr>
-            <w:r>
-              <w:rPr>
-                <w:sz w:val="17"/>
-                <w:szCs w:val="17"/>
+              <w:spacing w:before="10"/>
+            </w:pPr>
+            <w:r>
+              <w:rPr>
+                <w:sz w:val="16"/>
+                <w:szCs w:val="16"/>
               </w:rPr>
               <w:t>• Driving product discovery for new features in close collaboration with Product Managers and stakeholders</w:t>
             </w:r>
           </w:p>
           <w:p>
             <w:pPr>
-              <w:spacing w:before="30"/>
-            </w:pPr>
-            <w:r>
-              <w:rPr>
-                <w:sz w:val="17"/>
-                <w:szCs w:val="17"/>
+              <w:spacing w:before="10"/>
+            </w:pPr>
+            <w:r>
+              <w:rPr>
+                <w:sz w:val="16"/>
+                <w:szCs w:val="16"/>
               </w:rPr>
               <w:t>• Led the design and development of Verint's new Design System from scratch - built fully accessible, token-based components meeting WCAG 2.1 AA standards end-to-end (color contrast, keyboard navigation, screen reader support, focus management); created a Motion Library with Lottie animations and GIFs; worked closely with the dev team to ensure pixel-perfect Figma-to-code implementation</w:t>
             </w:r>
@@ -359,7 +359,7 @@
     </w:tbl>
     <w:p>
       <w:pPr>
-        <w:spacing w:after="80"/>
+        <w:spacing w:after="20"/>
       </w:pPr>
     </w:p>
     <w:tbl>
@@ -408,7 +408,7 @@
           </w:tcPr>
           <w:p>
             <w:pPr>
-              <w:spacing w:after="14"/>
+              <w:spacing w:after="4"/>
             </w:pPr>
             <w:r>
               <w:rPr>
@@ -450,7 +450,7 @@
           </w:tcPr>
           <w:p>
             <w:pPr>
-              <w:spacing w:after="40"/>
+              <w:spacing w:after="14"/>
             </w:pPr>
             <w:r>
               <w:rPr>
@@ -464,36 +464,36 @@
           </w:p>
           <w:p>
             <w:pPr>
-              <w:spacing w:before="30"/>
-            </w:pPr>
-            <w:r>
-              <w:rPr>
-                <w:sz w:val="17"/>
-                <w:szCs w:val="17"/>
+              <w:spacing w:before="10"/>
+            </w:pPr>
+            <w:r>
+              <w:rPr>
+                <w:sz w:val="16"/>
+                <w:szCs w:val="16"/>
               </w:rPr>
               <w:t>• Designed end-to-end product features for Verint's enterprise SaaS platform, progressing from individual contributor to senior designer over two years</w:t>
             </w:r>
           </w:p>
           <w:p>
             <w:pPr>
-              <w:spacing w:before="30"/>
-            </w:pPr>
-            <w:r>
-              <w:rPr>
-                <w:sz w:val="17"/>
-                <w:szCs w:val="17"/>
+              <w:spacing w:before="10"/>
+            </w:pPr>
+            <w:r>
+              <w:rPr>
+                <w:sz w:val="16"/>
+                <w:szCs w:val="16"/>
               </w:rPr>
               <w:t>• Conducted user research and interviews to inform design decisions and validate concepts throughout the product lifecycle</w:t>
             </w:r>
           </w:p>
           <w:p>
             <w:pPr>
-              <w:spacing w:before="30"/>
-            </w:pPr>
-            <w:r>
-              <w:rPr>
-                <w:sz w:val="17"/>
-                <w:szCs w:val="17"/>
+              <w:spacing w:before="10"/>
+            </w:pPr>
+            <w:r>
+              <w:rPr>
+                <w:sz w:val="16"/>
+                <w:szCs w:val="16"/>
               </w:rPr>
               <w:t>• Collaborated with PMs and the dev team in an agile environment from discovery through delivery, with a consistent focus on accessibility compliance and interaction quality</w:t>
             </w:r>
@@ -503,7 +503,7 @@
     </w:tbl>
     <w:p>
       <w:pPr>
-        <w:spacing w:after="80"/>
+        <w:spacing w:after="20"/>
       </w:pPr>
     </w:p>
     <w:tbl>
@@ -552,7 +552,7 @@
           </w:tcPr>
           <w:p>
             <w:pPr>
-              <w:spacing w:after="14"/>
+              <w:spacing w:after="4"/>
             </w:pPr>
             <w:r>
               <w:rPr>
@@ -594,7 +594,7 @@
           </w:tcPr>
           <w:p>
             <w:pPr>
-              <w:spacing w:after="40"/>
+              <w:spacing w:after="14"/>
             </w:pPr>
             <w:r>
               <w:rPr>
@@ -608,26 +608,26 @@
           </w:p>
           <w:p>
             <w:pPr>
-              <w:spacing w:before="30"/>
-            </w:pPr>
-            <w:r>
-              <w:rPr>
-                <w:sz w:val="17"/>
-                <w:szCs w:val="17"/>
-              </w:rPr>
-              <w:t>• Designed and built websites end-to-end - from client discovery and UX research to prototyping, development, and QA</w:t>
-            </w:r>
-          </w:p>
-          <w:p>
-            <w:pPr>
-              <w:spacing w:before="30"/>
-            </w:pPr>
-            <w:r>
-              <w:rPr>
-                <w:sz w:val="17"/>
-                <w:szCs w:val="17"/>
-              </w:rPr>
-              <w:t>• Responsible for all motion and animation work across projects: Lottie, GIFs, promotional videos, animated social content</w:t>
+              <w:spacing w:before="10"/>
+            </w:pPr>
+            <w:r>
+              <w:rPr>
+                <w:sz w:val="16"/>
+                <w:szCs w:val="16"/>
+              </w:rPr>
+              <w:t>• Designed and built websites end-to-end - from client discovery and UX research to prototyping, development, and QA</w:t>
+            </w:r>
+          </w:p>
+          <w:p>
+            <w:pPr>
+              <w:spacing w:before="10"/>
+            </w:pPr>
+            <w:r>
+              <w:rPr>
+                <w:sz w:val="16"/>
+                <w:szCs w:val="16"/>
+              </w:rPr>
+              <w:t>• Responsible for all motion and animation work across projects: Lottie, GIFs, promotional videos, animated social content</w:t>
             </w:r>
           </w:p>
         </w:tc>
@@ -635,7 +635,7 @@
     </w:tbl>
     <w:p>
       <w:pPr>
-        <w:spacing w:after="80"/>
+        <w:spacing w:after="20"/>
       </w:pPr>
     </w:p>
     <w:tbl>
@@ -684,7 +684,7 @@
           </w:tcPr>
           <w:p>
             <w:pPr>
-              <w:spacing w:after="14"/>
+              <w:spacing w:after="4"/>
             </w:pPr>
             <w:r>
               <w:rPr>
@@ -726,7 +726,7 @@
           </w:tcPr>
           <w:p>
             <w:pPr>
-              <w:spacing w:after="40"/>
+              <w:spacing w:after="14"/>
             </w:pPr>
             <w:r>
               <w:rPr>
@@ -740,12 +740,12 @@
           </w:p>
           <w:p>
             <w:pPr>
-              <w:spacing w:before="30"/>
-            </w:pPr>
-            <w:r>
-              <w:rPr>
-                <w:sz w:val="17"/>
-                <w:szCs w:val="17"/>
+              <w:spacing w:before="10"/>
+            </w:pPr>
+            <w:r>
+              <w:rPr>
+                <w:sz w:val="16"/>
+                <w:szCs w:val="16"/>
               </w:rPr>
               <w:t>• Classified role.</w:t>
             </w:r>
@@ -755,12 +755,12 @@
     </w:tbl>
     <w:p>
       <w:pPr>
-        <w:spacing w:after="140"/>
+        <w:spacing w:after="20"/>
       </w:pPr>
     </w:p>
     <w:p>
       <w:pPr>
-        <w:spacing w:before="220" w:after="100"/>
+        <w:spacing w:before="100" w:after="40"/>
       </w:pPr>
       <w:r>
         <w:rPr>
@@ -773,7 +773,7 @@
     </w:p>
     <w:p>
       <w:pPr>
-        <w:spacing w:after="60"/>
+        <w:spacing w:after="40"/>
       </w:pPr>
     </w:p>
     <w:tbl>
@@ -852,8 +852,8 @@
           <w:p>
             <w:r>
               <w:rPr>
-                <w:sz w:val="17"/>
-                <w:szCs w:val="17"/>
+                <w:sz w:val="16"/>
+                <w:szCs w:val="16"/>
               </w:rPr>
               <w:t>Product Discovery  •  User Research &amp; Interviews  •  Design Systems  •  Accessibility (WCAG 2.1)  •  Mobile UX  •  Wireframing &amp; Prototyping  •  Figma-to-Code  •  Motion Design  •  Team Leadership</w:t>
             </w:r>
@@ -915,8 +915,8 @@
           <w:p>
             <w:r>
               <w:rPr>
-                <w:sz w:val="17"/>
-                <w:szCs w:val="17"/>
+                <w:sz w:val="16"/>
+                <w:szCs w:val="16"/>
               </w:rPr>
               <w:t>Figma  •  Framer  •  Cursor  •  Illustrator  •  Photoshop  •  After Effects  •  Premiere Pro  •  WordPress  •  Elementor  •  HTML/CSS • Storybook</w:t>
             </w:r>
@@ -926,12 +926,12 @@
     </w:tbl>
     <w:p>
       <w:pPr>
-        <w:spacing w:after="140"/>
+        <w:spacing w:after="20"/>
       </w:pPr>
     </w:p>
     <w:p>
       <w:pPr>
-        <w:spacing w:before="220" w:after="100"/>
+        <w:spacing w:before="100" w:after="40"/>
       </w:pPr>
       <w:r>
         <w:rPr>
@@ -944,7 +944,7 @@
     </w:p>
     <w:p>
       <w:pPr>
-        <w:spacing w:after="80"/>
+        <w:spacing w:after="20"/>
       </w:pPr>
     </w:p>
     <w:tbl>
@@ -993,7 +993,7 @@
           </w:tcPr>
           <w:p>
             <w:pPr>
-              <w:spacing w:after="14"/>
+              <w:spacing w:after="4"/>
             </w:pPr>
             <w:r>
               <w:rPr>
@@ -1035,7 +1035,7 @@
           </w:tcPr>
           <w:p>
             <w:pPr>
-              <w:spacing w:after="40"/>
+              <w:spacing w:after="14"/>
             </w:pPr>
             <w:r>
               <w:rPr>
@@ -1049,12 +1049,12 @@
           </w:p>
           <w:p>
             <w:pPr>
-              <w:spacing w:before="30"/>
-            </w:pPr>
-            <w:r>
-              <w:rPr>
-                <w:sz w:val="17"/>
-                <w:szCs w:val="17"/>
+              <w:spacing w:before="10"/>
+            </w:pPr>
+            <w:r>
+              <w:rPr>
+                <w:sz w:val="16"/>
+                <w:szCs w:val="16"/>
               </w:rPr>
               <w:t>• Completed Google's official UX Design certification covering end-to-end product design, research, and prototyping</w:t>
             </w:r>
@@ -1064,7 +1064,7 @@
     </w:tbl>
     <w:p>
       <w:pPr>
-        <w:spacing w:after="80"/>
+        <w:spacing w:after="20"/>
       </w:pPr>
     </w:p>
     <w:tbl>
@@ -1113,7 +1113,7 @@
           </w:tcPr>
           <w:p>
             <w:pPr>
-              <w:spacing w:after="14"/>
+              <w:spacing w:after="4"/>
             </w:pPr>
             <w:r>
               <w:rPr>
@@ -1155,7 +1155,7 @@
           </w:tcPr>
           <w:p>
             <w:pPr>
-              <w:spacing w:after="40"/>
+              <w:spacing w:after="14"/>
             </w:pPr>
             <w:r>
               <w:rPr>
@@ -1169,12 +1169,12 @@
           </w:p>
           <w:p>
             <w:pPr>
-              <w:spacing w:before="30"/>
-            </w:pPr>
-            <w:r>
-              <w:rPr>
-                <w:sz w:val="17"/>
-                <w:szCs w:val="17"/>
+              <w:spacing w:before="10"/>
+            </w:pPr>
+            <w:r>
+              <w:rPr>
+                <w:sz w:val="16"/>
+                <w:szCs w:val="16"/>
               </w:rPr>
               <w:t>• Intensive program specializing in UX design, user experience, and Adobe Creative Suite</w:t>
             </w:r>
@@ -1184,12 +1184,12 @@
     </w:tbl>
     <w:p>
       <w:pPr>
-        <w:spacing w:after="140"/>
+        <w:spacing w:after="20"/>
       </w:pPr>
     </w:p>
     <w:p>
       <w:pPr>
-        <w:spacing w:before="220" w:after="100"/>
+        <w:spacing w:before="100" w:after="40"/>
       </w:pPr>
       <w:r>
         <w:rPr>
@@ -1202,7 +1202,7 @@
     </w:p>
     <w:p>
       <w:pPr>
-        <w:spacing w:after="80"/>
+        <w:spacing w:after="20"/>
       </w:pPr>
     </w:p>
     <w:tbl>
@@ -1251,7 +1251,7 @@
           </w:tcPr>
           <w:p>
             <w:pPr>
-              <w:spacing w:after="14"/>
+              <w:spacing w:after="4"/>
             </w:pPr>
             <w:r>
               <w:rPr>
@@ -1293,7 +1293,7 @@
           </w:tcPr>
           <w:p>
             <w:pPr>
-              <w:spacing w:after="40"/>
+              <w:spacing w:after="14"/>
             </w:pPr>
             <w:r>
               <w:rPr>
@@ -1307,36 +1307,36 @@
           </w:p>
           <w:p>
             <w:pPr>
-              <w:spacing w:before="30"/>
-            </w:pPr>
-            <w:r>
-              <w:rPr>
-                <w:sz w:val="17"/>
-                <w:szCs w:val="17"/>
+              <w:spacing w:before="10"/>
+            </w:pPr>
+            <w:r>
+              <w:rPr>
+                <w:sz w:val="16"/>
+                <w:szCs w:val="16"/>
               </w:rPr>
               <w:t>• Served in various command roles: squad commander, sergeant, company sergeant, platoon commander</w:t>
             </w:r>
           </w:p>
           <w:p>
             <w:pPr>
-              <w:spacing w:before="30"/>
-            </w:pPr>
-            <w:r>
-              <w:rPr>
-                <w:sz w:val="17"/>
-                <w:szCs w:val="17"/>
+              <w:spacing w:before="10"/>
+            </w:pPr>
+            <w:r>
+              <w:rPr>
+                <w:sz w:val="16"/>
+                <w:szCs w:val="16"/>
               </w:rPr>
               <w:t>• Participated in Operation Protective Edge</w:t>
             </w:r>
           </w:p>
           <w:p>
             <w:pPr>
-              <w:spacing w:before="30"/>
-            </w:pPr>
-            <w:r>
-              <w:rPr>
-                <w:sz w:val="17"/>
-                <w:szCs w:val="17"/>
+              <w:spacing w:before="10"/>
+            </w:pPr>
+            <w:r>
+              <w:rPr>
+                <w:sz w:val="16"/>
+                <w:szCs w:val="16"/>
               </w:rPr>
               <w:t>• Awarded the Protective Edge Medal and Independence Day Excellence Award</w:t>
             </w:r>
@@ -1346,12 +1346,12 @@
     </w:tbl>
     <w:p>
       <w:pPr>
-        <w:spacing w:after="140"/>
+        <w:spacing w:after="20"/>
       </w:pPr>
     </w:p>
     <w:p>
       <w:pPr>
-        <w:spacing w:before="220" w:after="100"/>
+        <w:spacing w:before="100" w:after="40"/>
       </w:pPr>
       <w:r>
         <w:rPr>
@@ -1364,21 +1364,21 @@
     </w:p>
     <w:p>
       <w:pPr>
-        <w:spacing w:before="80"/>
+        <w:spacing w:before="20"/>
       </w:pPr>
       <w:r>
         <w:rPr>
           <w:b/>
           <w:bCs/>
-          <w:sz w:val="17"/>
-          <w:szCs w:val="17"/>
+          <w:sz w:val="16"/>
+          <w:szCs w:val="16"/>
         </w:rPr>
         <w:t>Hebrew</w:t>
       </w:r>
       <w:r>
         <w:rPr>
-          <w:sz w:val="17"/>
-          <w:szCs w:val="17"/>
+          <w:sz w:val="16"/>
+          <w:szCs w:val="16"/>
         </w:rPr>
         <w:t xml:space="preserve"> - Native     </w:t>
       </w:r>
@@ -1386,22 +1386,22 @@
         <w:rPr>
           <w:b/>
           <w:bCs/>
-          <w:sz w:val="17"/>
-          <w:szCs w:val="17"/>
+          <w:sz w:val="16"/>
+          <w:szCs w:val="16"/>
         </w:rPr>
         <w:t>English</w:t>
       </w:r>
       <w:r>
         <w:rPr>
-          <w:sz w:val="17"/>
-          <w:szCs w:val="17"/>
+          <w:sz w:val="16"/>
+          <w:szCs w:val="16"/>
         </w:rPr>
         <w:t xml:space="preserve"> - Professional proficiency</w:t>
       </w:r>
     </w:p>
     <w:sectPr>
       <w:pgSz w:w="11906" w:h="16838"/>
-      <w:pgMar w:top="750" w:right="750" w:bottom="750" w:left="750" w:header="708" w:footer="708" w:gutter="0"/>
+      <w:pgMar w:top="500" w:right="650" w:bottom="500" w:left="650" w:header="708" w:footer="708" w:gutter="0"/>
       <w:cols w:space="720"/>
       <w:docGrid w:linePitch="360"/>
     </w:sectPr>

</xml_diff>